<commit_message>
Kaggle run live: robust dataset detection + clean slug + real notebook link
- notebook: dataset auto-detection now searches /kaggle/input recursively (the API
  attaches the dataset at /kaggle/input/datasets/<owner>/<slug>/, not /kaggle/input/<slug>/);
  the old one-level scan failed with 'No dataset with a train/ folder'. Verified on Kaggle:
  finds 100 classes under /kaggle/input/datasets/gpiosenka/sports-classification.
- kernel-metadata: clean public slug ardatezel/explainable-sports-classification
- submission docx + README: real Kaggle notebook link wired in (status Ready)

Co-Authored-By: Claude Opus 4.8 (1M context) <noreply@anthropic.com>
</commit_message>
<xml_diff>
--- a/submission/submission_links.docx
+++ b/submission/submission_links.docx
@@ -308,7 +308,7 @@
                 <w:color w:val="1A57B6"/>
                 <w:sz w:val="20"/>
               </w:rPr>
-              <w:t>[PASTE your Kaggle notebook link after you upload &amp; Run All]</w:t>
+              <w:t>https://www.kaggle.com/code/ardatezel/explainable-sports-classification</w:t>
             </w:r>
           </w:p>
         </w:tc>
@@ -322,12 +322,12 @@
             <w:r>
               <w:rPr>
                 <w:rFonts w:ascii="Calibri" w:hAnsi="Calibri"/>
-                <w:b w:val="0"/>
+                <w:b/>
                 <w:i w:val="0"/>
-                <w:color w:val="556374"/>
+                <w:color w:val="1E7A34"/>
                 <w:sz w:val="20"/>
               </w:rPr>
-              <w:t>Run &amp; paste</w:t>
+              <w:t>Ready</w:t>
             </w:r>
           </w:p>
         </w:tc>

</xml_diff>